<commit_message>
Completa expediente EP3 y defensa EP4 con evidencias QA
</commit_message>
<xml_diff>
--- a/01_Informe_EP3/Informe_EP3_Cuidarte_Formato_Oficial.docx
+++ b/01_Informe_EP3/Informe_EP3_Cuidarte_Formato_Oficial.docx
@@ -372,6 +372,14 @@
       </w:r>
     </w:p>
     <w:p>
+      <w:r>
+        <w:rPr>
+          <w:b w:val="0"/>
+        </w:rPr>
+        <w:t>Fuentes internas: D1 corresponde al informe EP1 del 8 de septiembre de 2026, conservado en 05_Antecedentes; D2 es la estrategia de pruebas de experiencia 2; D3 es la actividad 01-10 de ejecución UI, ambos originales en 03_Actividades_en_clases. La plantilla EP3, la pauta EP4 y las dos guías nuevas se conservan en 04_Guias_y_plantillas.</w:t>
+      </w:r>
+    </w:p>
+    <w:p>
       <w:pPr>
         <w:pStyle w:val="Heading2"/>
       </w:pPr>
@@ -1759,7 +1767,7 @@
           </w:tcPr>
           <w:p>
             <w:r>
-              <w:t>Pendiente de análisis completo</w:t>
+              <w:t>Usado, exportación disponible</w:t>
             </w:r>
           </w:p>
         </w:tc>
@@ -5307,7 +5315,7 @@
         <w:pStyle w:val="Heading3"/>
       </w:pPr>
       <w:r>
-        <w:t>Análisis estático</w:t>
+        <w:t>Resultados reales de SonarQube</w:t>
       </w:r>
     </w:p>
     <w:p>
@@ -5315,7 +5323,1254 @@
         <w:rPr>
           <w:b w:val="0"/>
         </w:rPr>
-        <w:t>SonarQube no cuenta todavía con exportación completa. No se inventan métricas. La revisión manual confirma rutas y parámetros; no confirma SQLi en un controlador inexistente.</w:t>
+        <w:t xml:space="preserve">Servidor </w:t>
+      </w:r>
+      <w:r>
+        <w:rPr>
+          <w:b/>
+        </w:rPr>
+        <w:t>9.9.8.100196</w:t>
+      </w:r>
+      <w:r>
+        <w:rPr>
+          <w:b w:val="0"/>
+        </w:rPr>
+        <w:t xml:space="preserve">, imagen oficial 9.9-community (línea LTA histórica), y SonarScanner CLI </w:t>
+      </w:r>
+      <w:r>
+        <w:rPr>
+          <w:b/>
+        </w:rPr>
+        <w:t>8.1.0.6389</w:t>
+      </w:r>
+      <w:r>
+        <w:rPr>
+          <w:b w:val="0"/>
+        </w:rPr>
+        <w:t xml:space="preserve">. Proyecto isy1102-cuidarte; código del snapshot 07_Codigo; exportaciones API y log del escáner en 06_Evidencias/sonarqube. El escáner terminó con EXECUTION SUCCESS y la tarea del servidor con SUCCESS. Se indexaron 63 archivos y se analizaron 56/56 archivos JavaScript. Quality Gate: </w:t>
+      </w:r>
+      <w:r>
+        <w:rPr>
+          <w:b/>
+        </w:rPr>
+        <w:t>OK</w:t>
+      </w:r>
+      <w:r>
+        <w:rPr>
+          <w:b w:val="0"/>
+        </w:rPr>
+        <w:t>.</w:t>
+      </w:r>
+    </w:p>
+    <w:tbl>
+      <w:tblPr>
+        <w:tblStyle w:val="TableGrid"/>
+        <w:tblW w:type="auto" w:w="0"/>
+        <w:tblLook w:firstColumn="1" w:firstRow="1" w:lastColumn="0" w:lastRow="0" w:noHBand="0" w:noVBand="1" w:val="04A0"/>
+      </w:tblPr>
+      <w:tblGrid>
+        <w:gridCol w:w="3249"/>
+        <w:gridCol w:w="3249"/>
+        <w:gridCol w:w="3249"/>
+      </w:tblGrid>
+      <w:tr>
+        <w:tc>
+          <w:tcPr>
+            <w:tcW w:type="dxa" w:w="3249"/>
+            <w:shd w:fill="E5EEF4"/>
+          </w:tcPr>
+          <w:p>
+            <w:r>
+              <w:rPr>
+                <w:b/>
+              </w:rPr>
+              <w:t>Métrica</w:t>
+            </w:r>
+          </w:p>
+        </w:tc>
+        <w:tc>
+          <w:tcPr>
+            <w:tcW w:type="dxa" w:w="3249"/>
+            <w:shd w:fill="E5EEF4"/>
+          </w:tcPr>
+          <w:p>
+            <w:r>
+              <w:rPr>
+                <w:b/>
+              </w:rPr>
+              <w:t>Valor</w:t>
+            </w:r>
+          </w:p>
+        </w:tc>
+        <w:tc>
+          <w:tcPr>
+            <w:tcW w:type="dxa" w:w="3249"/>
+            <w:shd w:fill="E5EEF4"/>
+          </w:tcPr>
+          <w:p>
+            <w:r>
+              <w:rPr>
+                <w:b/>
+              </w:rPr>
+              <w:t>Interpretación</w:t>
+            </w:r>
+          </w:p>
+        </w:tc>
+      </w:tr>
+      <w:tr>
+        <w:tc>
+          <w:tcPr>
+            <w:tcW w:type="dxa" w:w="3249"/>
+          </w:tcPr>
+          <w:p>
+            <w:r>
+              <w:t>Bugs</w:t>
+            </w:r>
+          </w:p>
+        </w:tc>
+        <w:tc>
+          <w:tcPr>
+            <w:tcW w:type="dxa" w:w="3249"/>
+          </w:tcPr>
+          <w:p>
+            <w:r>
+              <w:t>1</w:t>
+            </w:r>
+          </w:p>
+        </w:tc>
+        <w:tc>
+          <w:tcPr>
+            <w:tcW w:type="dxa" w:w="3249"/>
+          </w:tcPr>
+          <w:p>
+            <w:r>
+              <w:t>Medido por análisis</w:t>
+            </w:r>
+          </w:p>
+        </w:tc>
+      </w:tr>
+      <w:tr>
+        <w:tc>
+          <w:tcPr>
+            <w:tcW w:type="dxa" w:w="3249"/>
+          </w:tcPr>
+          <w:p>
+            <w:r>
+              <w:t>Vulnerabilities</w:t>
+            </w:r>
+          </w:p>
+        </w:tc>
+        <w:tc>
+          <w:tcPr>
+            <w:tcW w:type="dxa" w:w="3249"/>
+          </w:tcPr>
+          <w:p>
+            <w:r>
+              <w:t>0</w:t>
+            </w:r>
+          </w:p>
+        </w:tc>
+        <w:tc>
+          <w:tcPr>
+            <w:tcW w:type="dxa" w:w="3249"/>
+          </w:tcPr>
+          <w:p>
+            <w:r>
+              <w:t>Medido por análisis</w:t>
+            </w:r>
+          </w:p>
+        </w:tc>
+      </w:tr>
+      <w:tr>
+        <w:tc>
+          <w:tcPr>
+            <w:tcW w:type="dxa" w:w="3249"/>
+          </w:tcPr>
+          <w:p>
+            <w:r>
+              <w:t>Security Hotspots</w:t>
+            </w:r>
+          </w:p>
+        </w:tc>
+        <w:tc>
+          <w:tcPr>
+            <w:tcW w:type="dxa" w:w="3249"/>
+          </w:tcPr>
+          <w:p>
+            <w:r>
+              <w:t>3</w:t>
+            </w:r>
+          </w:p>
+        </w:tc>
+        <w:tc>
+          <w:tcPr>
+            <w:tcW w:type="dxa" w:w="3249"/>
+          </w:tcPr>
+          <w:p>
+            <w:r>
+              <w:t>Medido por análisis</w:t>
+            </w:r>
+          </w:p>
+        </w:tc>
+      </w:tr>
+      <w:tr>
+        <w:tc>
+          <w:tcPr>
+            <w:tcW w:type="dxa" w:w="3249"/>
+          </w:tcPr>
+          <w:p>
+            <w:r>
+              <w:t>Code Smells</w:t>
+            </w:r>
+          </w:p>
+        </w:tc>
+        <w:tc>
+          <w:tcPr>
+            <w:tcW w:type="dxa" w:w="3249"/>
+          </w:tcPr>
+          <w:p>
+            <w:r>
+              <w:t>72</w:t>
+            </w:r>
+          </w:p>
+        </w:tc>
+        <w:tc>
+          <w:tcPr>
+            <w:tcW w:type="dxa" w:w="3249"/>
+          </w:tcPr>
+          <w:p>
+            <w:r>
+              <w:t>Medido por análisis</w:t>
+            </w:r>
+          </w:p>
+        </w:tc>
+      </w:tr>
+      <w:tr>
+        <w:tc>
+          <w:tcPr>
+            <w:tcW w:type="dxa" w:w="3249"/>
+          </w:tcPr>
+          <w:p>
+            <w:r>
+              <w:t>Coverage (%)</w:t>
+            </w:r>
+          </w:p>
+        </w:tc>
+        <w:tc>
+          <w:tcPr>
+            <w:tcW w:type="dxa" w:w="3249"/>
+          </w:tcPr>
+          <w:p>
+            <w:r>
+              <w:t>0.0</w:t>
+            </w:r>
+          </w:p>
+        </w:tc>
+        <w:tc>
+          <w:tcPr>
+            <w:tcW w:type="dxa" w:w="3249"/>
+          </w:tcPr>
+          <w:p>
+            <w:r>
+              <w:t>Medido por análisis</w:t>
+            </w:r>
+          </w:p>
+        </w:tc>
+      </w:tr>
+      <w:tr>
+        <w:tc>
+          <w:tcPr>
+            <w:tcW w:type="dxa" w:w="3249"/>
+          </w:tcPr>
+          <w:p>
+            <w:r>
+              <w:t>Líneas de código</w:t>
+            </w:r>
+          </w:p>
+        </w:tc>
+        <w:tc>
+          <w:tcPr>
+            <w:tcW w:type="dxa" w:w="3249"/>
+          </w:tcPr>
+          <w:p>
+            <w:r>
+              <w:t>10133</w:t>
+            </w:r>
+          </w:p>
+        </w:tc>
+        <w:tc>
+          <w:tcPr>
+            <w:tcW w:type="dxa" w:w="3249"/>
+          </w:tcPr>
+          <w:p>
+            <w:r>
+              <w:t>Medido por análisis</w:t>
+            </w:r>
+          </w:p>
+        </w:tc>
+      </w:tr>
+      <w:tr>
+        <w:tc>
+          <w:tcPr>
+            <w:tcW w:type="dxa" w:w="3249"/>
+          </w:tcPr>
+          <w:p>
+            <w:r>
+              <w:t>Duplicación (%)</w:t>
+            </w:r>
+          </w:p>
+        </w:tc>
+        <w:tc>
+          <w:tcPr>
+            <w:tcW w:type="dxa" w:w="3249"/>
+          </w:tcPr>
+          <w:p>
+            <w:r>
+              <w:t>14.5</w:t>
+            </w:r>
+          </w:p>
+        </w:tc>
+        <w:tc>
+          <w:tcPr>
+            <w:tcW w:type="dxa" w:w="3249"/>
+          </w:tcPr>
+          <w:p>
+            <w:r>
+              <w:t>Medido por análisis</w:t>
+            </w:r>
+          </w:p>
+        </w:tc>
+      </w:tr>
+      <w:tr>
+        <w:tc>
+          <w:tcPr>
+            <w:tcW w:type="dxa" w:w="3249"/>
+          </w:tcPr>
+          <w:p>
+            <w:r>
+              <w:t>Hotspots revisados (%)</w:t>
+            </w:r>
+          </w:p>
+        </w:tc>
+        <w:tc>
+          <w:tcPr>
+            <w:tcW w:type="dxa" w:w="3249"/>
+          </w:tcPr>
+          <w:p>
+            <w:r>
+              <w:t>0.0</w:t>
+            </w:r>
+          </w:p>
+        </w:tc>
+        <w:tc>
+          <w:tcPr>
+            <w:tcW w:type="dxa" w:w="3249"/>
+          </w:tcPr>
+          <w:p>
+            <w:r>
+              <w:t>Medido por análisis</w:t>
+            </w:r>
+          </w:p>
+        </w:tc>
+      </w:tr>
+    </w:tbl>
+    <w:p/>
+    <w:p>
+      <w:r>
+        <w:rPr>
+          <w:b w:val="0"/>
+        </w:rPr>
+        <w:t>Bugs indican problemas potenciales de fiabilidad; vulnerabilities requieren validación y corrección; hotspots requieren revisión contextual, no son automáticamente una vulnerabilidad; code smells reflejan mantenibilidad. Coverage proviene de pruebas instrumentadas: no se generó LCOV. Un valor reportado de 0% no equivale a cero pruebas de API; significa que el análisis no recibió cobertura ejecutable. El resultado del gate no sustituye la decisión QA ni certifica cumplimiento legal.</w:t>
+      </w:r>
+    </w:p>
+    <w:tbl>
+      <w:tblPr>
+        <w:tblStyle w:val="TableGrid"/>
+        <w:tblW w:type="auto" w:w="0"/>
+        <w:tblLook w:firstColumn="1" w:firstRow="1" w:lastColumn="0" w:lastRow="0" w:noHBand="0" w:noVBand="1" w:val="04A0"/>
+      </w:tblPr>
+      <w:tblGrid>
+        <w:gridCol w:w="2436"/>
+        <w:gridCol w:w="2436"/>
+        <w:gridCol w:w="2436"/>
+        <w:gridCol w:w="2436"/>
+      </w:tblGrid>
+      <w:tr>
+        <w:tc>
+          <w:tcPr>
+            <w:tcW w:type="dxa" w:w="2436"/>
+            <w:shd w:fill="E5EEF4"/>
+          </w:tcPr>
+          <w:p>
+            <w:r>
+              <w:rPr>
+                <w:b/>
+              </w:rPr>
+              <w:t>Regla</w:t>
+            </w:r>
+          </w:p>
+        </w:tc>
+        <w:tc>
+          <w:tcPr>
+            <w:tcW w:type="dxa" w:w="2436"/>
+            <w:shd w:fill="E5EEF4"/>
+          </w:tcPr>
+          <w:p>
+            <w:r>
+              <w:rPr>
+                <w:b/>
+              </w:rPr>
+              <w:t>Severidad del analizador</w:t>
+            </w:r>
+          </w:p>
+        </w:tc>
+        <w:tc>
+          <w:tcPr>
+            <w:tcW w:type="dxa" w:w="2436"/>
+            <w:shd w:fill="E5EEF4"/>
+          </w:tcPr>
+          <w:p>
+            <w:r>
+              <w:rPr>
+                <w:b/>
+              </w:rPr>
+              <w:t>Archivo/línea</w:t>
+            </w:r>
+          </w:p>
+        </w:tc>
+        <w:tc>
+          <w:tcPr>
+            <w:tcW w:type="dxa" w:w="2436"/>
+            <w:shd w:fill="E5EEF4"/>
+          </w:tcPr>
+          <w:p>
+            <w:r>
+              <w:rPr>
+                <w:b/>
+              </w:rPr>
+              <w:t>Mensaje</w:t>
+            </w:r>
+          </w:p>
+        </w:tc>
+      </w:tr>
+      <w:tr>
+        <w:tc>
+          <w:tcPr>
+            <w:tcW w:type="dxa" w:w="2436"/>
+          </w:tcPr>
+          <w:p>
+            <w:r>
+              <w:t>javascript:S3776</w:t>
+            </w:r>
+          </w:p>
+        </w:tc>
+        <w:tc>
+          <w:tcPr>
+            <w:tcW w:type="dxa" w:w="2436"/>
+          </w:tcPr>
+          <w:p>
+            <w:r>
+              <w:t>CRITICAL</w:t>
+            </w:r>
+          </w:p>
+        </w:tc>
+        <w:tc>
+          <w:tcPr>
+            <w:tcW w:type="dxa" w:w="2436"/>
+          </w:tcPr>
+          <w:p>
+            <w:r>
+              <w:t>BACKEND/src/routes/auth.js:71</w:t>
+            </w:r>
+          </w:p>
+        </w:tc>
+        <w:tc>
+          <w:tcPr>
+            <w:tcW w:type="dxa" w:w="2436"/>
+          </w:tcPr>
+          <w:p>
+            <w:r>
+              <w:t>Refactor this function to reduce its Cognitive Complexity from 17 to the 15 allowed.</w:t>
+            </w:r>
+          </w:p>
+        </w:tc>
+      </w:tr>
+      <w:tr>
+        <w:tc>
+          <w:tcPr>
+            <w:tcW w:type="dxa" w:w="2436"/>
+          </w:tcPr>
+          <w:p>
+            <w:r>
+              <w:t>javascript:S3776</w:t>
+            </w:r>
+          </w:p>
+        </w:tc>
+        <w:tc>
+          <w:tcPr>
+            <w:tcW w:type="dxa" w:w="2436"/>
+          </w:tcPr>
+          <w:p>
+            <w:r>
+              <w:t>CRITICAL</w:t>
+            </w:r>
+          </w:p>
+        </w:tc>
+        <w:tc>
+          <w:tcPr>
+            <w:tcW w:type="dxa" w:w="2436"/>
+          </w:tcPr>
+          <w:p>
+            <w:r>
+              <w:t>BACKEND/src/routes/pacientes.js:48</w:t>
+            </w:r>
+          </w:p>
+        </w:tc>
+        <w:tc>
+          <w:tcPr>
+            <w:tcW w:type="dxa" w:w="2436"/>
+          </w:tcPr>
+          <w:p>
+            <w:r>
+              <w:t>Refactor this function to reduce its Cognitive Complexity from 22 to the 15 allowed.</w:t>
+            </w:r>
+          </w:p>
+        </w:tc>
+      </w:tr>
+      <w:tr>
+        <w:tc>
+          <w:tcPr>
+            <w:tcW w:type="dxa" w:w="2436"/>
+          </w:tcPr>
+          <w:p>
+            <w:r>
+              <w:t>javascript:S3776</w:t>
+            </w:r>
+          </w:p>
+        </w:tc>
+        <w:tc>
+          <w:tcPr>
+            <w:tcW w:type="dxa" w:w="2436"/>
+          </w:tcPr>
+          <w:p>
+            <w:r>
+              <w:t>CRITICAL</w:t>
+            </w:r>
+          </w:p>
+        </w:tc>
+        <w:tc>
+          <w:tcPr>
+            <w:tcW w:type="dxa" w:w="2436"/>
+          </w:tcPr>
+          <w:p>
+            <w:r>
+              <w:t>BACKEND/src/routes/pacientes.js:276</w:t>
+            </w:r>
+          </w:p>
+        </w:tc>
+        <w:tc>
+          <w:tcPr>
+            <w:tcW w:type="dxa" w:w="2436"/>
+          </w:tcPr>
+          <w:p>
+            <w:r>
+              <w:t>Refactor this function to reduce its Cognitive Complexity from 21 to the 15 allowed.</w:t>
+            </w:r>
+          </w:p>
+        </w:tc>
+      </w:tr>
+      <w:tr>
+        <w:tc>
+          <w:tcPr>
+            <w:tcW w:type="dxa" w:w="2436"/>
+          </w:tcPr>
+          <w:p>
+            <w:r>
+              <w:t>javascript:S3776</w:t>
+            </w:r>
+          </w:p>
+        </w:tc>
+        <w:tc>
+          <w:tcPr>
+            <w:tcW w:type="dxa" w:w="2436"/>
+          </w:tcPr>
+          <w:p>
+            <w:r>
+              <w:t>CRITICAL</w:t>
+            </w:r>
+          </w:p>
+        </w:tc>
+        <w:tc>
+          <w:tcPr>
+            <w:tcW w:type="dxa" w:w="2436"/>
+          </w:tcPr>
+          <w:p>
+            <w:r>
+              <w:t>BACKEND/src/routes/users.js:283</w:t>
+            </w:r>
+          </w:p>
+        </w:tc>
+        <w:tc>
+          <w:tcPr>
+            <w:tcW w:type="dxa" w:w="2436"/>
+          </w:tcPr>
+          <w:p>
+            <w:r>
+              <w:t>Refactor this function to reduce its Cognitive Complexity from 27 to the 15 allowed.</w:t>
+            </w:r>
+          </w:p>
+        </w:tc>
+      </w:tr>
+      <w:tr>
+        <w:tc>
+          <w:tcPr>
+            <w:tcW w:type="dxa" w:w="2436"/>
+          </w:tcPr>
+          <w:p>
+            <w:r>
+              <w:t>javascript:S3776</w:t>
+            </w:r>
+          </w:p>
+        </w:tc>
+        <w:tc>
+          <w:tcPr>
+            <w:tcW w:type="dxa" w:w="2436"/>
+          </w:tcPr>
+          <w:p>
+            <w:r>
+              <w:t>CRITICAL</w:t>
+            </w:r>
+          </w:p>
+        </w:tc>
+        <w:tc>
+          <w:tcPr>
+            <w:tcW w:type="dxa" w:w="2436"/>
+          </w:tcPr>
+          <w:p>
+            <w:r>
+              <w:t>BACKEND/src/routes/users.js:437</w:t>
+            </w:r>
+          </w:p>
+        </w:tc>
+        <w:tc>
+          <w:tcPr>
+            <w:tcW w:type="dxa" w:w="2436"/>
+          </w:tcPr>
+          <w:p>
+            <w:r>
+              <w:t>Refactor this function to reduce its Cognitive Complexity from 24 to the 15 allowed.</w:t>
+            </w:r>
+          </w:p>
+        </w:tc>
+      </w:tr>
+      <w:tr>
+        <w:tc>
+          <w:tcPr>
+            <w:tcW w:type="dxa" w:w="2436"/>
+          </w:tcPr>
+          <w:p>
+            <w:r>
+              <w:t>javascript:S3776</w:t>
+            </w:r>
+          </w:p>
+        </w:tc>
+        <w:tc>
+          <w:tcPr>
+            <w:tcW w:type="dxa" w:w="2436"/>
+          </w:tcPr>
+          <w:p>
+            <w:r>
+              <w:t>CRITICAL</w:t>
+            </w:r>
+          </w:p>
+        </w:tc>
+        <w:tc>
+          <w:tcPr>
+            <w:tcW w:type="dxa" w:w="2436"/>
+          </w:tcPr>
+          <w:p>
+            <w:r>
+              <w:t>FRONTEND/src/pages/examenes/ExamenForm.jsx:47</w:t>
+            </w:r>
+          </w:p>
+        </w:tc>
+        <w:tc>
+          <w:tcPr>
+            <w:tcW w:type="dxa" w:w="2436"/>
+          </w:tcPr>
+          <w:p>
+            <w:r>
+              <w:t>Refactor this function to reduce its Cognitive Complexity from 33 to the 15 allowed.</w:t>
+            </w:r>
+          </w:p>
+        </w:tc>
+      </w:tr>
+      <w:tr>
+        <w:tc>
+          <w:tcPr>
+            <w:tcW w:type="dxa" w:w="2436"/>
+          </w:tcPr>
+          <w:p>
+            <w:r>
+              <w:t>javascript:S3776</w:t>
+            </w:r>
+          </w:p>
+        </w:tc>
+        <w:tc>
+          <w:tcPr>
+            <w:tcW w:type="dxa" w:w="2436"/>
+          </w:tcPr>
+          <w:p>
+            <w:r>
+              <w:t>CRITICAL</w:t>
+            </w:r>
+          </w:p>
+        </w:tc>
+        <w:tc>
+          <w:tcPr>
+            <w:tcW w:type="dxa" w:w="2436"/>
+          </w:tcPr>
+          <w:p>
+            <w:r>
+              <w:t>FRONTEND/src/pages/pacientes/PacienteForm.jsx:21</w:t>
+            </w:r>
+          </w:p>
+        </w:tc>
+        <w:tc>
+          <w:tcPr>
+            <w:tcW w:type="dxa" w:w="2436"/>
+          </w:tcPr>
+          <w:p>
+            <w:r>
+              <w:t>Refactor this function to reduce its Cognitive Complexity from 22 to the 15 allowed.</w:t>
+            </w:r>
+          </w:p>
+        </w:tc>
+      </w:tr>
+      <w:tr>
+        <w:tc>
+          <w:tcPr>
+            <w:tcW w:type="dxa" w:w="2436"/>
+          </w:tcPr>
+          <w:p>
+            <w:r>
+              <w:t>javascript:S3776</w:t>
+            </w:r>
+          </w:p>
+        </w:tc>
+        <w:tc>
+          <w:tcPr>
+            <w:tcW w:type="dxa" w:w="2436"/>
+          </w:tcPr>
+          <w:p>
+            <w:r>
+              <w:t>CRITICAL</w:t>
+            </w:r>
+          </w:p>
+        </w:tc>
+        <w:tc>
+          <w:tcPr>
+            <w:tcW w:type="dxa" w:w="2436"/>
+          </w:tcPr>
+          <w:p>
+            <w:r>
+              <w:t>FRONTEND/src/pages/usuarios/UsuarioForm.jsx:173</w:t>
+            </w:r>
+          </w:p>
+        </w:tc>
+        <w:tc>
+          <w:tcPr>
+            <w:tcW w:type="dxa" w:w="2436"/>
+          </w:tcPr>
+          <w:p>
+            <w:r>
+              <w:t>Refactor this function to reduce its Cognitive Complexity from 39 to the 15 allowed.</w:t>
+            </w:r>
+          </w:p>
+        </w:tc>
+      </w:tr>
+      <w:tr>
+        <w:tc>
+          <w:tcPr>
+            <w:tcW w:type="dxa" w:w="2436"/>
+          </w:tcPr>
+          <w:p>
+            <w:r>
+              <w:t>javascript:S4165</w:t>
+            </w:r>
+          </w:p>
+        </w:tc>
+        <w:tc>
+          <w:tcPr>
+            <w:tcW w:type="dxa" w:w="2436"/>
+          </w:tcPr>
+          <w:p>
+            <w:r>
+              <w:t>MAJOR</w:t>
+            </w:r>
+          </w:p>
+        </w:tc>
+        <w:tc>
+          <w:tcPr>
+            <w:tcW w:type="dxa" w:w="2436"/>
+          </w:tcPr>
+          <w:p>
+            <w:r>
+              <w:t>BACKEND/src/routes/documentos.js:244</w:t>
+            </w:r>
+          </w:p>
+        </w:tc>
+        <w:tc>
+          <w:tcPr>
+            <w:tcW w:type="dxa" w:w="2436"/>
+          </w:tcPr>
+          <w:p>
+            <w:r>
+              <w:t>Review this redundant assignment: "contentType" already holds the assigned value along all execution paths.</w:t>
+            </w:r>
+          </w:p>
+        </w:tc>
+      </w:tr>
+      <w:tr>
+        <w:tc>
+          <w:tcPr>
+            <w:tcW w:type="dxa" w:w="2436"/>
+          </w:tcPr>
+          <w:p>
+            <w:r>
+              <w:t>javascript:S4624</w:t>
+            </w:r>
+          </w:p>
+        </w:tc>
+        <w:tc>
+          <w:tcPr>
+            <w:tcW w:type="dxa" w:w="2436"/>
+          </w:tcPr>
+          <w:p>
+            <w:r>
+              <w:t>MAJOR</w:t>
+            </w:r>
+          </w:p>
+        </w:tc>
+        <w:tc>
+          <w:tcPr>
+            <w:tcW w:type="dxa" w:w="2436"/>
+          </w:tcPr>
+          <w:p>
+            <w:r>
+              <w:t>BACKEND/src/routes/users.js:60</w:t>
+            </w:r>
+          </w:p>
+        </w:tc>
+        <w:tc>
+          <w:tcPr>
+            <w:tcW w:type="dxa" w:w="2436"/>
+          </w:tcPr>
+          <w:p>
+            <w:r>
+              <w:t>Refactor this code to not use nested template literals.</w:t>
+            </w:r>
+          </w:p>
+        </w:tc>
+      </w:tr>
+      <w:tr>
+        <w:tc>
+          <w:tcPr>
+            <w:tcW w:type="dxa" w:w="2436"/>
+          </w:tcPr>
+          <w:p>
+            <w:r>
+              <w:t>javascript:S1854</w:t>
+            </w:r>
+          </w:p>
+        </w:tc>
+        <w:tc>
+          <w:tcPr>
+            <w:tcW w:type="dxa" w:w="2436"/>
+          </w:tcPr>
+          <w:p>
+            <w:r>
+              <w:t>MAJOR</w:t>
+            </w:r>
+          </w:p>
+        </w:tc>
+        <w:tc>
+          <w:tcPr>
+            <w:tcW w:type="dxa" w:w="2436"/>
+          </w:tcPr>
+          <w:p>
+            <w:r>
+              <w:t>FRONTEND/src/components/RoleGuard.jsx:28</w:t>
+            </w:r>
+          </w:p>
+        </w:tc>
+        <w:tc>
+          <w:tcPr>
+            <w:tcW w:type="dxa" w:w="2436"/>
+          </w:tcPr>
+          <w:p>
+            <w:r>
+              <w:t>Remove this useless assignment to variable "location".</w:t>
+            </w:r>
+          </w:p>
+        </w:tc>
+      </w:tr>
+      <w:tr>
+        <w:tc>
+          <w:tcPr>
+            <w:tcW w:type="dxa" w:w="2436"/>
+          </w:tcPr>
+          <w:p>
+            <w:r>
+              <w:t>css:S4649</w:t>
+            </w:r>
+          </w:p>
+        </w:tc>
+        <w:tc>
+          <w:tcPr>
+            <w:tcW w:type="dxa" w:w="2436"/>
+          </w:tcPr>
+          <w:p>
+            <w:r>
+              <w:t>MAJOR</w:t>
+            </w:r>
+          </w:p>
+        </w:tc>
+        <w:tc>
+          <w:tcPr>
+            <w:tcW w:type="dxa" w:w="2436"/>
+          </w:tcPr>
+          <w:p>
+            <w:r>
+              <w:t>FRONTEND/src/index.css:6</w:t>
+            </w:r>
+          </w:p>
+        </w:tc>
+        <w:tc>
+          <w:tcPr>
+            <w:tcW w:type="dxa" w:w="2436"/>
+          </w:tcPr>
+          <w:p>
+            <w:r>
+              <w:t>Unexpected missing generic font family</w:t>
+            </w:r>
+          </w:p>
+        </w:tc>
+      </w:tr>
+    </w:tbl>
+    <w:p/>
+    <w:p>
+      <w:r>
+        <w:rPr>
+          <w:b w:val="0"/>
+        </w:rPr>
+        <w:t>La hipótesis de SQLi del encargo menciona backend/src/controllers/examenes.controller.js, archivo ausente. El código real usa BACKEND/src/routes/examenes.js y consultas parametrizadas observadas. No se atribuye a SonarQube una SQLi que no figure en sus issues. Si una edición del analizador no detecta un riesgo confirmado por API, la evidencia dinámica conserva validez y debe tratarse en QA.</w:t>
+      </w:r>
+    </w:p>
+    <w:p>
+      <w:pPr>
+        <w:pStyle w:val="Heading3"/>
+      </w:pPr>
+      <w:r>
+        <w:t>Hallazgos estáticos concretos y comparación con criterios</w:t>
+      </w:r>
+    </w:p>
+    <w:tbl>
+      <w:tblPr>
+        <w:tblStyle w:val="TableGrid"/>
+        <w:tblW w:type="auto" w:w="0"/>
+        <w:tblLook w:firstColumn="1" w:firstRow="1" w:lastColumn="0" w:lastRow="0" w:noHBand="0" w:noVBand="1" w:val="04A0"/>
+      </w:tblPr>
+      <w:tblGrid>
+        <w:gridCol w:w="2436"/>
+        <w:gridCol w:w="2436"/>
+        <w:gridCol w:w="2436"/>
+        <w:gridCol w:w="2436"/>
+      </w:tblGrid>
+      <w:tr>
+        <w:tc>
+          <w:tcPr>
+            <w:tcW w:type="dxa" w:w="2436"/>
+            <w:shd w:fill="E5EEF4"/>
+          </w:tcPr>
+          <w:p>
+            <w:r>
+              <w:rPr>
+                <w:b/>
+              </w:rPr>
+              <w:t>Hallazgo real</w:t>
+            </w:r>
+          </w:p>
+        </w:tc>
+        <w:tc>
+          <w:tcPr>
+            <w:tcW w:type="dxa" w:w="2436"/>
+            <w:shd w:fill="E5EEF4"/>
+          </w:tcPr>
+          <w:p>
+            <w:r>
+              <w:rPr>
+                <w:b/>
+              </w:rPr>
+              <w:t>Ubicación</w:t>
+            </w:r>
+          </w:p>
+        </w:tc>
+        <w:tc>
+          <w:tcPr>
+            <w:tcW w:type="dxa" w:w="2436"/>
+            <w:shd w:fill="E5EEF4"/>
+          </w:tcPr>
+          <w:p>
+            <w:r>
+              <w:rPr>
+                <w:b/>
+              </w:rPr>
+              <w:t>Interpretación técnica y criterio</w:t>
+            </w:r>
+          </w:p>
+        </w:tc>
+        <w:tc>
+          <w:tcPr>
+            <w:tcW w:type="dxa" w:w="2436"/>
+            <w:shd w:fill="E5EEF4"/>
+          </w:tcPr>
+          <w:p>
+            <w:r>
+              <w:rPr>
+                <w:b/>
+              </w:rPr>
+              <w:t>Acción propuesta</w:t>
+            </w:r>
+          </w:p>
+        </w:tc>
+      </w:tr>
+      <w:tr>
+        <w:tc>
+          <w:tcPr>
+            <w:tcW w:type="dxa" w:w="2436"/>
+          </w:tcPr>
+          <w:p>
+            <w:r>
+              <w:t>css:S4649, BUG MAJOR</w:t>
+            </w:r>
+          </w:p>
+        </w:tc>
+        <w:tc>
+          <w:tcPr>
+            <w:tcW w:type="dxa" w:w="2436"/>
+          </w:tcPr>
+          <w:p>
+            <w:r>
+              <w:t>FRONTEND/src/index.css:6</w:t>
+            </w:r>
+          </w:p>
+        </w:tc>
+        <w:tc>
+          <w:tcPr>
+            <w:tcW w:type="dxa" w:w="2436"/>
+          </w:tcPr>
+          <w:p>
+            <w:r>
+              <w:t>Falta familia tipográfica genérica de respaldo; afecta robustez visual/usabilidad. No demuestra por sí solo incumplimiento WCAG AA</w:t>
+            </w:r>
+          </w:p>
+        </w:tc>
+        <w:tc>
+          <w:tcPr>
+            <w:tcW w:type="dxa" w:w="2436"/>
+          </w:tcPr>
+          <w:p>
+            <w:r>
+              <w:t>Añadir respaldo adecuado y verificar legibilidad y zoom</w:t>
+            </w:r>
+          </w:p>
+        </w:tc>
+      </w:tr>
+      <w:tr>
+        <w:tc>
+          <w:tcPr>
+            <w:tcW w:type="dxa" w:w="2436"/>
+          </w:tcPr>
+          <w:p>
+            <w:r>
+              <w:t>javascript:S5693, hotspot TO_REVIEW</w:t>
+            </w:r>
+          </w:p>
+        </w:tc>
+        <w:tc>
+          <w:tcPr>
+            <w:tcW w:type="dxa" w:w="2436"/>
+          </w:tcPr>
+          <w:p>
+            <w:r>
+              <w:t>BACKEND/src/routes/documentos.js:11</w:t>
+            </w:r>
+          </w:p>
+        </w:tc>
+        <w:tc>
+          <w:tcPr>
+            <w:tcW w:type="dxa" w:w="2436"/>
+          </w:tcPr>
+          <w:p>
+            <w:r>
+              <w:t>Revisar límite de carga y memoria; riesgo de disponibilidad si múltiples archivos agotan recursos</w:t>
+            </w:r>
+          </w:p>
+        </w:tc>
+        <w:tc>
+          <w:tcPr>
+            <w:tcW w:type="dxa" w:w="2436"/>
+          </w:tcPr>
+          <w:p>
+            <w:r>
+              <w:t>Validar límite, concurrencia, almacenamiento y controles por actor</w:t>
+            </w:r>
+          </w:p>
+        </w:tc>
+      </w:tr>
+      <w:tr>
+        <w:tc>
+          <w:tcPr>
+            <w:tcW w:type="dxa" w:w="2436"/>
+          </w:tcPr>
+          <w:p>
+            <w:r>
+              <w:t>javascript:S5122, hotspot TO_REVIEW</w:t>
+            </w:r>
+          </w:p>
+        </w:tc>
+        <w:tc>
+          <w:tcPr>
+            <w:tcW w:type="dxa" w:w="2436"/>
+          </w:tcPr>
+          <w:p>
+            <w:r>
+              <w:t>BACKEND/src/app.js:21</w:t>
+            </w:r>
+          </w:p>
+        </w:tc>
+        <w:tc>
+          <w:tcPr>
+            <w:tcW w:type="dxa" w:w="2436"/>
+          </w:tcPr>
+          <w:p>
+            <w:r>
+              <w:t>CORS abierto requiere evaluación contextual de orígenes; se relaciona con protección de datos de salud, sin probar por sí solo acceso no autorizado</w:t>
+            </w:r>
+          </w:p>
+        </w:tc>
+        <w:tc>
+          <w:tcPr>
+            <w:tcW w:type="dxa" w:w="2436"/>
+          </w:tcPr>
+          <w:p>
+            <w:r>
+              <w:t>Definir allowlist y probar origen permitido/no permitido; mantener autorización por recurso</w:t>
+            </w:r>
+          </w:p>
+        </w:tc>
+      </w:tr>
+      <w:tr>
+        <w:tc>
+          <w:tcPr>
+            <w:tcW w:type="dxa" w:w="2436"/>
+          </w:tcPr>
+          <w:p>
+            <w:r>
+              <w:t>javascript:S5689, hotspot TO_REVIEW</w:t>
+            </w:r>
+          </w:p>
+        </w:tc>
+        <w:tc>
+          <w:tcPr>
+            <w:tcW w:type="dxa" w:w="2436"/>
+          </w:tcPr>
+          <w:p>
+            <w:r>
+              <w:t>BACKEND/src/app.js:19</w:t>
+            </w:r>
+          </w:p>
+        </w:tc>
+        <w:tc>
+          <w:tcPr>
+            <w:tcW w:type="dxa" w:w="2436"/>
+          </w:tcPr>
+          <w:p>
+            <w:r>
+              <w:t>Exposición de identificación tecnológica; revisión de configuración y superficie de información</w:t>
+            </w:r>
+          </w:p>
+        </w:tc>
+        <w:tc>
+          <w:tcPr>
+            <w:tcW w:type="dxa" w:w="2436"/>
+          </w:tcPr>
+          <w:p>
+            <w:r>
+              <w:t>Evaluar encabezados y deshabilitar divulgación innecesaria</w:t>
+            </w:r>
+          </w:p>
+        </w:tc>
+      </w:tr>
+      <w:tr>
+        <w:tc>
+          <w:tcPr>
+            <w:tcW w:type="dxa" w:w="2436"/>
+          </w:tcPr>
+          <w:p>
+            <w:r>
+              <w:t>72 Code Smells</w:t>
+            </w:r>
+          </w:p>
+        </w:tc>
+        <w:tc>
+          <w:tcPr>
+            <w:tcW w:type="dxa" w:w="2436"/>
+          </w:tcPr>
+          <w:p>
+            <w:r>
+              <w:t>issues.json y Hallazgos_sonar.csv</w:t>
+            </w:r>
+          </w:p>
+        </w:tc>
+        <w:tc>
+          <w:tcPr>
+            <w:tcW w:type="dxa" w:w="2436"/>
+          </w:tcPr>
+          <w:p>
+            <w:r>
+              <w:t>Deuda de mantenibilidad conforme al criterio de calidad ISO/IEC 25010; no equivalen a 72 vulnerabilidades</w:t>
+            </w:r>
+          </w:p>
+        </w:tc>
+        <w:tc>
+          <w:tcPr>
+            <w:tcW w:type="dxa" w:w="2436"/>
+          </w:tcPr>
+          <w:p>
+            <w:r>
+              <w:t>Priorizar complejidad y duplicación con regresión</w:t>
+            </w:r>
+          </w:p>
+        </w:tc>
+      </w:tr>
+    </w:tbl>
+    <w:p/>
+    <w:p>
+      <w:r>
+        <w:rPr>
+          <w:b w:val="0"/>
+        </w:rPr>
+        <w:t>La exportación del gate indica status OK y conditions vacío: no aporta condiciones evaluadas que permitan inferir el cumplimiento de nuestros umbrales de aceptación. Cero vulnerabilidades SAST no significa ausencia de vulnerabilidades: la API confirmó dos defectos críticos de autorización. Los tres hotspots permanecen TO_REVIEW, con 0% de revisión en la herramienta. No se simula que hayan sido cerrados.</w:t>
+      </w:r>
+    </w:p>
+    <w:p>
+      <w:r>
+        <w:rPr>
+          <w:b w:val="0"/>
+        </w:rPr>
+        <w:t>Limitación de compatibilidad: el analizador advirtió que Node.js 22 no era una versión recomendada para esa edición (recomendaba 16/18). Aun así registró 56/56 archivos JavaScript analizados y completó el reporte. Se documenta la advertencia y se requiere repetir con una combinación validada antes de una certificación final. La edición LTA histórica se usa solo para este análisis académico local; no se presenta como recomendación productiva vigente. El primer intento con la imagen reciente quedó en arranque bajo presión de memoria y se conserva como diagnóstico separado, sin mezclar resultados.</w:t>
       </w:r>
     </w:p>
     <w:p>
@@ -7325,6 +8580,94 @@
           <w:b w:val="0"/>
         </w:rPr>
         <w:t>Pendientes reales: ERS íntegra y feedback docente; grabación nativa de Chrome Recorder/TestCase Studio/Selenium IDE si la docente la exige específicamente; DAST y cobertura; evaluación AA y usuarios; carga sostenida. El paquete contiene toda la documentación posible y registra estas limitaciones expresamente.</w:t>
+      </w:r>
+    </w:p>
+    <w:p>
+      <w:pPr>
+        <w:pStyle w:val="Heading2"/>
+      </w:pPr>
+      <w:r>
+        <w:t>Evidencia visual — sonarqube_metricas_exportadas.png</w:t>
+      </w:r>
+    </w:p>
+    <w:p>
+      <w:r>
+        <w:drawing>
+          <wp:inline>
+            <wp:extent cx="5486400" cy="3657600"/>
+            <wp:docPr id="28643493" name="Picture 28643493"/>
+            <wp:cNvGraphicFramePr>
+              <a:graphicFrameLocks noChangeAspect="1"/>
+            </wp:cNvGraphicFramePr>
+            <a:graphic>
+              <a:graphicData uri="http://schemas.openxmlformats.org/drawingml/2006/picture">
+                <pic:pic>
+                  <pic:nvPicPr>
+                    <pic:cNvPr id="0" name="sonarqube_metricas_exportadas.png"/>
+                    <pic:cNvPicPr/>
+                  </pic:nvPicPr>
+                  <pic:blipFill>
+                    <a:blip r:embed="rId9"/>
+                    <a:stretch>
+                      <a:fillRect/>
+                    </a:stretch>
+                  </pic:blipFill>
+                  <pic:spPr>
+                    <a:xfrm>
+                      <a:off x="0" y="0"/>
+                      <a:ext cx="5486400" cy="3657600"/>
+                    </a:xfrm>
+                    <a:prstGeom prst="rect"/>
+                  </pic:spPr>
+                </pic:pic>
+              </a:graphicData>
+            </a:graphic>
+          </wp:inline>
+        </w:drawing>
+      </w:r>
+    </w:p>
+    <w:p>
+      <w:pPr>
+        <w:pStyle w:val="Heading2"/>
+      </w:pPr>
+      <w:r>
+        <w:t>Evidencia visual — resultados_api.png</w:t>
+      </w:r>
+    </w:p>
+    <w:p>
+      <w:r>
+        <w:drawing>
+          <wp:inline>
+            <wp:extent cx="5486400" cy="4000500"/>
+            <wp:docPr id="28643494" name="Picture 28643494"/>
+            <wp:cNvGraphicFramePr>
+              <a:graphicFrameLocks noChangeAspect="1"/>
+            </wp:cNvGraphicFramePr>
+            <a:graphic>
+              <a:graphicData uri="http://schemas.openxmlformats.org/drawingml/2006/picture">
+                <pic:pic>
+                  <pic:nvPicPr>
+                    <pic:cNvPr id="0" name="resultados_api.png"/>
+                    <pic:cNvPicPr/>
+                  </pic:nvPicPr>
+                  <pic:blipFill>
+                    <a:blip r:embed="rId10"/>
+                    <a:stretch>
+                      <a:fillRect/>
+                    </a:stretch>
+                  </pic:blipFill>
+                  <pic:spPr>
+                    <a:xfrm>
+                      <a:off x="0" y="0"/>
+                      <a:ext cx="5486400" cy="4000500"/>
+                    </a:xfrm>
+                    <a:prstGeom prst="rect"/>
+                  </pic:spPr>
+                </pic:pic>
+              </a:graphicData>
+            </a:graphic>
+          </wp:inline>
+        </w:drawing>
       </w:r>
     </w:p>
     <w:sectPr>

</xml_diff>